<commit_message>
docs(sync): refresh complete storage coverage inventory
</commit_message>
<xml_diff>
--- a/jackyun-portal/docs/sync-v5-full-data-recovery-progress-3.52.4-20261028.docx
+++ b/jackyun-portal/docs/sync-v5-full-data-recovery-progress-3.52.4-20261028.docx
@@ -69,7 +69,7 @@
     </w:p>
     <w:p>
       <w:r>
-        <w:t xml:space="preserve">仓库生成的同步清单包含 256 项存储键/调用点，其中 187 项仍标注为 v2/v4 候选，50 项为设备本地或其他本地用途。清单同时识别出 6 类独立 Supabase/API 业务所有者：离线任务与复习操作、QuizWise 云端历史、专注会话与番茄任务、阅读架与阅读进度、个人站点定义以及 IELTS 写作工作区。个人站点、写作和部分离线数据已经有 v5 交接或工作区映射；其余仍有独立 API、RLS、业务副作用或操作回执语义。</w:t>
+        <w:t xml:space="preserve">2026-10-28 重新扫描的机器清单覆盖 590 个源文件、738 个存储调用点、256 个 localStorage 键模式和 30 个 IndexedDB 调用点。256 个键模式中，186 个仍标注为 v2/v4 路径且是 v5 候选，51 个明确是设备本地/非同步用途，其余是 v5、v4/v5 元数据或条件继承映射。该分类是代码所有权/协议盘点，不等于每个候选都完成了 v5 业务往返验收。清单同时识别 6 类独立 Supabase/API 业务所有者；个人站点、写作和部分离线数据已有 v5 交接或工作区映射，QuizWise 云历史、专注会话/番茄任务、小说书架/阅读进度及离线工作区 mutations 仍有独立业务 API、RLS、副作用或回执语义。最新机器清单保存为 docs/sync-v5-coverage-matrix-20261028.json。</w:t>
       </w:r>
     </w:p>
     <w:p>
@@ -353,7 +353,7 @@
     </w:p>
     <w:p>
       <w:r>
-        <w:t xml:space="preserve">新增 applyLocalPageImport，将恢复点、校验、页面替换和仓库 flush 按顺序协调；tests/local-backup-performance.test.mts 覆盖大于 1 MB Schedule、恢复点读回和失败时不报告成功；backup-center-panel.tsx 统一调用该持久化路径。既有 queueV5ResourceDeletion 仍保护最后一条 CUE 与草稿的明确删除。Portal 版本为 3.52.4；当前覆盖底表尚待逐项转化为业务域真实读写验收，目标 4.0.0 未宣称完成。</w:t>
+        <w:t xml:space="preserve">新增 applyLocalPageImport，将恢复点、校验、页面替换和仓库 flush 按顺序协调；tests/local-backup-performance.test.mts 覆盖大于 1 MB Schedule、恢复点读回和失败时不报告成功；backup-center-panel.tsx 统一调用该持久化路径。最新机器清单为 docs/sync-v5-coverage-matrix-20261028.json，覆盖 256 个本机键模式、30 个 IndexedDB 调用点与独立 API 所有者；它是迁移底表，不代表每条记录均已 v5 验收。Portal 版本为 3.52.4；全资源端到端迁移尚未完成，目标 4.0.0 未宣称完成。</w:t>
       </w:r>
     </w:p>
     <w:sectPr>

</xml_diff>